<commit_message>
Feat: Multi-template DOCX selection and conditional button visibility
</commit_message>
<xml_diff>
--- a/public/templates/Informe_de_necessitats_ADO.docx
+++ b/public/templates/Informe_de_necessitats_ADO.docx
@@ -20,7 +20,7 @@
           <w:szCs w:val="20"/>
           <w:lang w:val="ca-ES"/>
         </w:rPr>
-        <w:t xml:space="preserve">Informe relatiu a la despesa realitzada pel procediment de contracte menor </w:t>
+        <w:t>Informe relatiu a la despesa realitzada pel procediment de contracte menor</w:t>
       </w:r>
       <w:r>
         <w:rPr>
@@ -31,8 +31,9 @@
           <w:szCs w:val="20"/>
           <w:lang w:val="ca-ES"/>
         </w:rPr>
-        <w:t>per l’òrgan de contractació</w:t>
-      </w:r>
+        <w:t xml:space="preserve"> </w:t>
+      </w:r>
+      <w:proofErr w:type="spellStart"/>
       <w:r>
         <w:rPr>
           <w:rFonts w:ascii="Open Sans Light" w:eastAsia="Open Sans Light" w:hAnsi="Open Sans Light" w:cs="Open Sans Light"/>
@@ -42,6 +43,40 @@
           <w:szCs w:val="20"/>
           <w:lang w:val="ca-ES"/>
         </w:rPr>
+        <w:t>express</w:t>
+      </w:r>
+      <w:proofErr w:type="spellEnd"/>
+      <w:r>
+        <w:rPr>
+          <w:rFonts w:ascii="Open Sans Light" w:eastAsia="Open Sans Light" w:hAnsi="Open Sans Light" w:cs="Open Sans Light"/>
+          <w:b/>
+          <w:bCs/>
+          <w:sz w:val="20"/>
+          <w:szCs w:val="20"/>
+          <w:lang w:val="ca-ES"/>
+        </w:rPr>
+        <w:t xml:space="preserve"> </w:t>
+      </w:r>
+      <w:r>
+        <w:rPr>
+          <w:rFonts w:ascii="Open Sans Light" w:eastAsia="Open Sans Light" w:hAnsi="Open Sans Light" w:cs="Open Sans Light"/>
+          <w:b/>
+          <w:bCs/>
+          <w:sz w:val="20"/>
+          <w:szCs w:val="20"/>
+          <w:lang w:val="ca-ES"/>
+        </w:rPr>
+        <w:t>per l’òrgan de contractació</w:t>
+      </w:r>
+      <w:r>
+        <w:rPr>
+          <w:rFonts w:ascii="Open Sans Light" w:eastAsia="Open Sans Light" w:hAnsi="Open Sans Light" w:cs="Open Sans Light"/>
+          <w:b/>
+          <w:bCs/>
+          <w:sz w:val="20"/>
+          <w:szCs w:val="20"/>
+          <w:lang w:val="ca-ES"/>
+        </w:rPr>
         <w:t xml:space="preserve"> </w:t>
       </w:r>
       <w:r>
@@ -187,7 +222,18 @@
           <w:szCs w:val="20"/>
           <w:lang w:val="ca-ES"/>
         </w:rPr>
-        <w:t>Europeu i del Consell 2014/23/UE i 2014/24/UE, de 26 de febrer de 2014, en endavant, LCSP,</w:t>
+        <w:t>Europeu i del Consell 2014/23/UE i 2014/24/UE, de 26 de febrer de 2014, en endava</w:t>
+      </w:r>
+      <w:bookmarkStart w:id="0" w:name="_GoBack"/>
+      <w:bookmarkEnd w:id="0"/>
+      <w:r>
+        <w:rPr>
+          <w:rFonts w:ascii="Open Sans Light" w:eastAsia="Open Sans Light" w:hAnsi="Open Sans Light" w:cs="Open Sans Light"/>
+          <w:sz w:val="20"/>
+          <w:szCs w:val="20"/>
+          <w:lang w:val="ca-ES"/>
+        </w:rPr>
+        <w:t>nt, LCSP,</w:t>
       </w:r>
     </w:p>
     <w:p>
@@ -2999,8 +3045,6 @@
           <w:szCs w:val="20"/>
         </w:rPr>
       </w:pPr>
-      <w:bookmarkStart w:id="0" w:name="_GoBack"/>
-      <w:bookmarkEnd w:id="0"/>
     </w:p>
     <w:sectPr>
       <w:pgSz w:w="11906" w:h="16838"/>
@@ -3874,12 +3918,14 @@
 </file>
 
 <file path=customXml/item1.xml><?xml version="1.0" encoding="utf-8"?>
-<?mso-contentType ?>
-<FormTemplates xmlns="http://schemas.microsoft.com/sharepoint/v3/contenttype/forms">
-  <Display>DocumentLibraryForm</Display>
-  <Edit>DocumentLibraryForm</Edit>
-  <New>DocumentLibraryForm</New>
-</FormTemplates>
+<p:properties xmlns:p="http://schemas.microsoft.com/office/2006/metadata/properties" xmlns:xsi="http://www.w3.org/2001/XMLSchema-instance" xmlns:pc="http://schemas.microsoft.com/office/infopath/2007/PartnerControls">
+  <documentManagement>
+    <TaxCatchAll xmlns="108d9c73-5d46-4471-9bd8-029f5de3680f" xsi:nil="true"/>
+    <lcf76f155ced4ddcb4097134ff3c332f xmlns="74cf42d7-5302-4f1c-a14a-4e00bba5b2a8">
+      <Terms xmlns="http://schemas.microsoft.com/office/infopath/2007/PartnerControls"/>
+    </lcf76f155ced4ddcb4097134ff3c332f>
+  </documentManagement>
+</p:properties>
 </file>
 
 <file path=customXml/item2.xml><?xml version="1.0" encoding="utf-8"?>
@@ -4112,14 +4158,12 @@
 </file>
 
 <file path=customXml/item3.xml><?xml version="1.0" encoding="utf-8"?>
-<p:properties xmlns:p="http://schemas.microsoft.com/office/2006/metadata/properties" xmlns:xsi="http://www.w3.org/2001/XMLSchema-instance" xmlns:pc="http://schemas.microsoft.com/office/infopath/2007/PartnerControls">
-  <documentManagement>
-    <TaxCatchAll xmlns="108d9c73-5d46-4471-9bd8-029f5de3680f" xsi:nil="true"/>
-    <lcf76f155ced4ddcb4097134ff3c332f xmlns="74cf42d7-5302-4f1c-a14a-4e00bba5b2a8">
-      <Terms xmlns="http://schemas.microsoft.com/office/infopath/2007/PartnerControls"/>
-    </lcf76f155ced4ddcb4097134ff3c332f>
-  </documentManagement>
-</p:properties>
+<?mso-contentType ?>
+<FormTemplates xmlns="http://schemas.microsoft.com/sharepoint/v3/contenttype/forms">
+  <Display>DocumentLibraryForm</Display>
+  <Edit>DocumentLibraryForm</Edit>
+  <New>DocumentLibraryForm</New>
+</FormTemplates>
 </file>
 
 <file path=customXml/item4.xml><?xml version="1.0" encoding="utf-8"?>
@@ -4127,9 +4171,12 @@
 </file>
 
 <file path=customXml/itemProps1.xml><?xml version="1.0" encoding="utf-8"?>
-<ds:datastoreItem xmlns:ds="http://schemas.openxmlformats.org/officeDocument/2006/customXml" ds:itemID="{150801C8-2C01-424E-BC6C-56C9B08C462E}">
+<ds:datastoreItem xmlns:ds="http://schemas.openxmlformats.org/officeDocument/2006/customXml" ds:itemID="{EF14DB54-CEC9-47B5-A13D-53C8A329E037}">
   <ds:schemaRefs>
-    <ds:schemaRef ds:uri="http://schemas.microsoft.com/sharepoint/v3/contenttype/forms"/>
+    <ds:schemaRef ds:uri="http://schemas.microsoft.com/office/2006/metadata/properties"/>
+    <ds:schemaRef ds:uri="http://schemas.microsoft.com/office/infopath/2007/PartnerControls"/>
+    <ds:schemaRef ds:uri="108d9c73-5d46-4471-9bd8-029f5de3680f"/>
+    <ds:schemaRef ds:uri="74cf42d7-5302-4f1c-a14a-4e00bba5b2a8"/>
   </ds:schemaRefs>
 </ds:datastoreItem>
 </file>
@@ -4154,18 +4201,15 @@
 </file>
 
 <file path=customXml/itemProps3.xml><?xml version="1.0" encoding="utf-8"?>
-<ds:datastoreItem xmlns:ds="http://schemas.openxmlformats.org/officeDocument/2006/customXml" ds:itemID="{EF14DB54-CEC9-47B5-A13D-53C8A329E037}">
+<ds:datastoreItem xmlns:ds="http://schemas.openxmlformats.org/officeDocument/2006/customXml" ds:itemID="{150801C8-2C01-424E-BC6C-56C9B08C462E}">
   <ds:schemaRefs>
-    <ds:schemaRef ds:uri="http://schemas.microsoft.com/office/2006/metadata/properties"/>
-    <ds:schemaRef ds:uri="http://schemas.microsoft.com/office/infopath/2007/PartnerControls"/>
-    <ds:schemaRef ds:uri="108d9c73-5d46-4471-9bd8-029f5de3680f"/>
-    <ds:schemaRef ds:uri="74cf42d7-5302-4f1c-a14a-4e00bba5b2a8"/>
+    <ds:schemaRef ds:uri="http://schemas.microsoft.com/sharepoint/v3/contenttype/forms"/>
   </ds:schemaRefs>
 </ds:datastoreItem>
 </file>
 
 <file path=customXml/itemProps4.xml><?xml version="1.0" encoding="utf-8"?>
-<ds:datastoreItem xmlns:ds="http://schemas.openxmlformats.org/officeDocument/2006/customXml" ds:itemID="{6BCECA3C-BDBE-4B5F-B928-BBD36FC1681B}">
+<ds:datastoreItem xmlns:ds="http://schemas.openxmlformats.org/officeDocument/2006/customXml" ds:itemID="{09F81EE7-FD6A-498B-B7E9-7C7635C7396D}">
   <ds:schemaRefs>
     <ds:schemaRef ds:uri="http://schemas.openxmlformats.org/officeDocument/2006/bibliography"/>
   </ds:schemaRefs>

</xml_diff>